<commit_message>
Complete ML pipeline with classification tuning and SHAP
</commit_message>
<xml_diff>
--- a/Student Performance Predictor/PROJECT FULL DATA.docx
+++ b/Student Performance Predictor/PROJECT FULL DATA.docx
@@ -3,635 +3,48 @@
 <w:document xmlns:wpc="http://schemas.microsoft.com/office/word/2010/wordprocessingCanvas" xmlns:mc="http://schemas.openxmlformats.org/markup-compatibility/2006" xmlns:o="urn:schemas-microsoft-com:office:office" xmlns:r="http://schemas.openxmlformats.org/officeDocument/2006/relationships" xmlns:m="http://schemas.openxmlformats.org/officeDocument/2006/math" xmlns:v="urn:schemas-microsoft-com:vml" xmlns:wp14="http://schemas.microsoft.com/office/word/2010/wordprocessingDrawing" xmlns:wp="http://schemas.openxmlformats.org/drawingml/2006/wordprocessingDrawing" xmlns:w10="urn:schemas-microsoft-com:office:word" xmlns:w="http://schemas.openxmlformats.org/wordprocessingml/2006/main" xmlns:w14="http://schemas.microsoft.com/office/word/2010/wordml" xmlns:wpg="http://schemas.microsoft.com/office/word/2010/wordprocessingGroup" xmlns:wpi="http://schemas.microsoft.com/office/word/2010/wordprocessingInk" xmlns:wne="http://schemas.microsoft.com/office/word/2006/wordml" xmlns:wps="http://schemas.microsoft.com/office/word/2010/wordprocessingShape" mc:Ignorable="w14 wp14">
   <w:body>
     <w:p>
-      <w:pPr>
-        <w:spacing w:after="0" w:line="240" w:lineRule="auto"/>
+      <w:r>
         <w:rPr>
-          <w:rFonts w:ascii="Times New Roman" w:eastAsia="Times New Roman" w:hAnsi="Times New Roman" w:cs="Times New Roman"/>
+          <w:rFonts w:ascii="Times New Roman" w:eastAsia="Times New Roman" w:hAnsi="Symbol" w:cs="Times New Roman"/>
+          <w:b/>
           <w:sz w:val="24"/>
           <w:szCs w:val="24"/>
         </w:rPr>
-      </w:pPr>
-      <w:proofErr w:type="gramStart"/>
-      <w:r>
-        <w:rPr>
-          <w:rFonts w:ascii="Times New Roman" w:eastAsia="Times New Roman" w:hAnsi="Symbol" w:cs="Times New Roman"/>
-          <w:sz w:val="24"/>
-          <w:szCs w:val="24"/>
-        </w:rPr>
-        <w:t></w:t>
-      </w:r>
-      <w:r>
-        <w:rPr>
-          <w:rFonts w:ascii="Times New Roman" w:eastAsia="Times New Roman" w:hAnsi="Times New Roman" w:cs="Times New Roman"/>
-          <w:sz w:val="24"/>
-          <w:szCs w:val="24"/>
-        </w:rPr>
-        <w:t xml:space="preserve">  </w:t>
-      </w:r>
-      <w:r>
-        <w:rPr>
-          <w:rFonts w:ascii="Calibri" w:eastAsia="Times New Roman" w:hAnsi="Calibri" w:cs="Calibri"/>
-          <w:sz w:val="24"/>
-          <w:szCs w:val="24"/>
-        </w:rPr>
-        <w:t>✅</w:t>
-      </w:r>
-      <w:proofErr w:type="gramEnd"/>
-      <w:r>
-        <w:rPr>
-          <w:rFonts w:ascii="Times New Roman" w:eastAsia="Times New Roman" w:hAnsi="Times New Roman" w:cs="Times New Roman"/>
-          <w:sz w:val="24"/>
-          <w:szCs w:val="24"/>
-        </w:rPr>
-        <w:t xml:space="preserve"> Dataset </w:t>
-      </w:r>
-    </w:p>
-    <w:p>
-      <w:pPr>
-        <w:spacing w:after="0" w:line="240" w:lineRule="auto"/>
-        <w:rPr>
-          <w:rFonts w:ascii="Times New Roman" w:eastAsia="Times New Roman" w:hAnsi="Times New Roman" w:cs="Times New Roman"/>
-          <w:sz w:val="24"/>
-          <w:szCs w:val="24"/>
-        </w:rPr>
-      </w:pPr>
-      <w:proofErr w:type="gramStart"/>
-      <w:r>
-        <w:rPr>
-          <w:rFonts w:ascii="Times New Roman" w:eastAsia="Times New Roman" w:hAnsi="Symbol" w:cs="Times New Roman"/>
-          <w:sz w:val="24"/>
-          <w:szCs w:val="24"/>
-        </w:rPr>
-        <w:t></w:t>
-      </w:r>
-      <w:r>
-        <w:rPr>
-          <w:rFonts w:ascii="Times New Roman" w:eastAsia="Times New Roman" w:hAnsi="Times New Roman" w:cs="Times New Roman"/>
-          <w:sz w:val="24"/>
-          <w:szCs w:val="24"/>
-        </w:rPr>
-        <w:t xml:space="preserve">  ✅</w:t>
-      </w:r>
-      <w:proofErr w:type="gramEnd"/>
-      <w:r>
-        <w:rPr>
-          <w:rFonts w:ascii="Times New Roman" w:eastAsia="Times New Roman" w:hAnsi="Times New Roman" w:cs="Times New Roman"/>
-          <w:sz w:val="24"/>
-          <w:szCs w:val="24"/>
-        </w:rPr>
-        <w:t xml:space="preserve"> Preprocessing </w:t>
-      </w:r>
-    </w:p>
-    <w:p>
-      <w:pPr>
-        <w:spacing w:after="0" w:line="240" w:lineRule="auto"/>
-        <w:rPr>
-          <w:rFonts w:ascii="Times New Roman" w:eastAsia="Times New Roman" w:hAnsi="Times New Roman" w:cs="Times New Roman"/>
-          <w:sz w:val="24"/>
-          <w:szCs w:val="24"/>
-        </w:rPr>
-      </w:pPr>
-      <w:proofErr w:type="gramStart"/>
-      <w:r>
-        <w:rPr>
-          <w:rFonts w:ascii="Times New Roman" w:eastAsia="Times New Roman" w:hAnsi="Symbol" w:cs="Times New Roman"/>
-          <w:sz w:val="24"/>
-          <w:szCs w:val="24"/>
-        </w:rPr>
-        <w:t></w:t>
-      </w:r>
-      <w:r>
-        <w:rPr>
-          <w:rFonts w:ascii="Times New Roman" w:eastAsia="Times New Roman" w:hAnsi="Times New Roman" w:cs="Times New Roman"/>
-          <w:sz w:val="24"/>
-          <w:szCs w:val="24"/>
-        </w:rPr>
-        <w:t xml:space="preserve">  ✅</w:t>
-      </w:r>
-      <w:proofErr w:type="gramEnd"/>
-      <w:r>
-        <w:rPr>
-          <w:rFonts w:ascii="Times New Roman" w:eastAsia="Times New Roman" w:hAnsi="Times New Roman" w:cs="Times New Roman"/>
-          <w:sz w:val="24"/>
-          <w:szCs w:val="24"/>
-        </w:rPr>
-        <w:t xml:space="preserve"> Train multiple ML models </w:t>
-      </w:r>
-    </w:p>
-    <w:p>
-      <w:pPr>
-        <w:spacing w:after="0" w:line="240" w:lineRule="auto"/>
-        <w:rPr>
-          <w:rFonts w:ascii="Times New Roman" w:eastAsia="Times New Roman" w:hAnsi="Times New Roman" w:cs="Times New Roman"/>
-          <w:sz w:val="24"/>
-          <w:szCs w:val="24"/>
-        </w:rPr>
-      </w:pPr>
-      <w:proofErr w:type="gramStart"/>
-      <w:r>
-        <w:rPr>
-          <w:rFonts w:ascii="Times New Roman" w:eastAsia="Times New Roman" w:hAnsi="Symbol" w:cs="Times New Roman"/>
-          <w:sz w:val="24"/>
-          <w:szCs w:val="24"/>
-        </w:rPr>
-        <w:t></w:t>
-      </w:r>
-      <w:r>
-        <w:rPr>
-          <w:rFonts w:ascii="Times New Roman" w:eastAsia="Times New Roman" w:hAnsi="Times New Roman" w:cs="Times New Roman"/>
-          <w:sz w:val="24"/>
-          <w:szCs w:val="24"/>
-        </w:rPr>
-        <w:t xml:space="preserve">  ✅</w:t>
-      </w:r>
-      <w:proofErr w:type="gramEnd"/>
-      <w:r>
-        <w:rPr>
-          <w:rFonts w:ascii="Times New Roman" w:eastAsia="Times New Roman" w:hAnsi="Times New Roman" w:cs="Times New Roman"/>
-          <w:sz w:val="24"/>
-          <w:szCs w:val="24"/>
-        </w:rPr>
-        <w:t xml:space="preserve"> Model comparison </w:t>
-      </w:r>
-    </w:p>
-    <w:p>
-      <w:pPr>
-        <w:spacing w:after="0" w:line="240" w:lineRule="auto"/>
-        <w:rPr>
-          <w:rFonts w:ascii="Times New Roman" w:eastAsia="Times New Roman" w:hAnsi="Times New Roman" w:cs="Times New Roman"/>
-          <w:sz w:val="24"/>
-          <w:szCs w:val="24"/>
-        </w:rPr>
-      </w:pPr>
-      <w:proofErr w:type="gramStart"/>
-      <w:r>
-        <w:rPr>
-          <w:rFonts w:ascii="Times New Roman" w:eastAsia="Times New Roman" w:hAnsi="Symbol" w:cs="Times New Roman"/>
-          <w:sz w:val="24"/>
-          <w:szCs w:val="24"/>
-        </w:rPr>
-        <w:t></w:t>
-      </w:r>
-      <w:r>
-        <w:rPr>
-          <w:rFonts w:ascii="Times New Roman" w:eastAsia="Times New Roman" w:hAnsi="Times New Roman" w:cs="Times New Roman"/>
-          <w:sz w:val="24"/>
-          <w:szCs w:val="24"/>
-        </w:rPr>
-        <w:t xml:space="preserve">  ✅</w:t>
-      </w:r>
-      <w:proofErr w:type="gramEnd"/>
-      <w:r>
-        <w:rPr>
-          <w:rFonts w:ascii="Times New Roman" w:eastAsia="Times New Roman" w:hAnsi="Times New Roman" w:cs="Times New Roman"/>
-          <w:sz w:val="24"/>
-          <w:szCs w:val="24"/>
-        </w:rPr>
-        <w:t xml:space="preserve"> Best-model selection </w:t>
-      </w:r>
-    </w:p>
-    <w:p>
-      <w:pPr>
-        <w:spacing w:after="0" w:line="240" w:lineRule="auto"/>
-        <w:rPr>
-          <w:rFonts w:ascii="Times New Roman" w:eastAsia="Times New Roman" w:hAnsi="Times New Roman" w:cs="Times New Roman"/>
-          <w:sz w:val="24"/>
-          <w:szCs w:val="24"/>
-        </w:rPr>
-      </w:pPr>
-      <w:proofErr w:type="gramStart"/>
-      <w:r>
-        <w:rPr>
-          <w:rFonts w:ascii="Times New Roman" w:eastAsia="Times New Roman" w:hAnsi="Symbol" w:cs="Times New Roman"/>
-          <w:sz w:val="24"/>
-          <w:szCs w:val="24"/>
-        </w:rPr>
-        <w:t></w:t>
-      </w:r>
-      <w:r>
-        <w:rPr>
-          <w:rFonts w:ascii="Times New Roman" w:eastAsia="Times New Roman" w:hAnsi="Times New Roman" w:cs="Times New Roman"/>
-          <w:sz w:val="24"/>
-          <w:szCs w:val="24"/>
-        </w:rPr>
-        <w:t xml:space="preserve">  ✅</w:t>
-      </w:r>
-      <w:proofErr w:type="gramEnd"/>
-      <w:r>
-        <w:rPr>
-          <w:rFonts w:ascii="Times New Roman" w:eastAsia="Times New Roman" w:hAnsi="Times New Roman" w:cs="Times New Roman"/>
-          <w:sz w:val="24"/>
-          <w:szCs w:val="24"/>
-        </w:rPr>
-        <w:t xml:space="preserve"> Evaluation </w:t>
-      </w:r>
-    </w:p>
-    <w:p>
-      <w:pPr>
-        <w:spacing w:after="0" w:line="240" w:lineRule="auto"/>
-        <w:rPr>
-          <w:rFonts w:ascii="Times New Roman" w:eastAsia="Times New Roman" w:hAnsi="Times New Roman" w:cs="Times New Roman"/>
-          <w:sz w:val="24"/>
-          <w:szCs w:val="24"/>
-        </w:rPr>
-      </w:pPr>
-      <w:proofErr w:type="gramStart"/>
-      <w:r>
-        <w:rPr>
-          <w:rFonts w:ascii="Times New Roman" w:eastAsia="Times New Roman" w:hAnsi="Symbol" w:cs="Times New Roman"/>
-          <w:sz w:val="24"/>
-          <w:szCs w:val="24"/>
-        </w:rPr>
-        <w:t></w:t>
-      </w:r>
-      <w:r>
-        <w:rPr>
-          <w:rFonts w:ascii="Times New Roman" w:eastAsia="Times New Roman" w:hAnsi="Times New Roman" w:cs="Times New Roman"/>
-          <w:sz w:val="24"/>
-          <w:szCs w:val="24"/>
-        </w:rPr>
-        <w:t xml:space="preserve">  ✅</w:t>
-      </w:r>
-      <w:proofErr w:type="gramEnd"/>
-      <w:r>
-        <w:rPr>
-          <w:rFonts w:ascii="Times New Roman" w:eastAsia="Times New Roman" w:hAnsi="Times New Roman" w:cs="Times New Roman"/>
-          <w:sz w:val="24"/>
-          <w:szCs w:val="24"/>
-        </w:rPr>
-        <w:t xml:space="preserve"> </w:t>
-      </w:r>
-      <w:proofErr w:type="spellStart"/>
-      <w:r>
-        <w:rPr>
-          <w:rFonts w:ascii="Times New Roman" w:eastAsia="Times New Roman" w:hAnsi="Times New Roman" w:cs="Times New Roman"/>
-          <w:sz w:val="24"/>
-          <w:szCs w:val="24"/>
-        </w:rPr>
-        <w:t>FastAPI</w:t>
-      </w:r>
-      <w:proofErr w:type="spellEnd"/>
-      <w:r>
-        <w:rPr>
-          <w:rFonts w:ascii="Times New Roman" w:eastAsia="Times New Roman" w:hAnsi="Times New Roman" w:cs="Times New Roman"/>
-          <w:sz w:val="24"/>
-          <w:szCs w:val="24"/>
-        </w:rPr>
-        <w:t xml:space="preserve"> API </w:t>
-      </w:r>
-    </w:p>
-    <w:p>
-      <w:pPr>
-        <w:spacing w:after="0" w:line="240" w:lineRule="auto"/>
-        <w:rPr>
-          <w:rFonts w:ascii="Times New Roman" w:eastAsia="Times New Roman" w:hAnsi="Times New Roman" w:cs="Times New Roman"/>
-          <w:sz w:val="24"/>
-          <w:szCs w:val="24"/>
-        </w:rPr>
-      </w:pPr>
-      <w:proofErr w:type="gramStart"/>
-      <w:r>
-        <w:rPr>
-          <w:rFonts w:ascii="Times New Roman" w:eastAsia="Times New Roman" w:hAnsi="Symbol" w:cs="Times New Roman"/>
-          <w:sz w:val="24"/>
-          <w:szCs w:val="24"/>
-        </w:rPr>
-        <w:t></w:t>
-      </w:r>
-      <w:r>
-        <w:rPr>
-          <w:rFonts w:ascii="Times New Roman" w:eastAsia="Times New Roman" w:hAnsi="Times New Roman" w:cs="Times New Roman"/>
-          <w:sz w:val="24"/>
-          <w:szCs w:val="24"/>
-        </w:rPr>
-        <w:t xml:space="preserve">  ✅</w:t>
-      </w:r>
-      <w:proofErr w:type="gramEnd"/>
-      <w:r>
-        <w:rPr>
-          <w:rFonts w:ascii="Times New Roman" w:eastAsia="Times New Roman" w:hAnsi="Times New Roman" w:cs="Times New Roman"/>
-          <w:sz w:val="24"/>
-          <w:szCs w:val="24"/>
-        </w:rPr>
-        <w:t xml:space="preserve"> Frontend </w:t>
-      </w:r>
-    </w:p>
-    <w:p>
-      <w:pPr>
-        <w:spacing w:after="0" w:line="240" w:lineRule="auto"/>
-        <w:rPr>
-          <w:rFonts w:ascii="Times New Roman" w:eastAsia="Times New Roman" w:hAnsi="Times New Roman" w:cs="Times New Roman"/>
-          <w:sz w:val="24"/>
-          <w:szCs w:val="24"/>
-        </w:rPr>
-      </w:pPr>
-      <w:proofErr w:type="gramStart"/>
-      <w:r>
-        <w:rPr>
-          <w:rFonts w:ascii="Times New Roman" w:eastAsia="Times New Roman" w:hAnsi="Symbol" w:cs="Times New Roman"/>
-          <w:sz w:val="24"/>
-          <w:szCs w:val="24"/>
-        </w:rPr>
-        <w:t></w:t>
-      </w:r>
-      <w:r>
-        <w:rPr>
-          <w:rFonts w:ascii="Times New Roman" w:eastAsia="Times New Roman" w:hAnsi="Times New Roman" w:cs="Times New Roman"/>
-          <w:sz w:val="24"/>
-          <w:szCs w:val="24"/>
-        </w:rPr>
-        <w:t xml:space="preserve">  </w:t>
-      </w:r>
-      <w:r>
-        <w:rPr>
-          <w:rFonts w:ascii="Times New Roman" w:eastAsia="Times New Roman" w:hAnsi="Times New Roman" w:cs="Times New Roman"/>
-          <w:sz w:val="24"/>
-          <w:szCs w:val="24"/>
-        </w:rPr>
-        <w:t/>
-      </w:r>
-      <w:proofErr w:type="gramEnd"/>
-      <w:r>
-        <w:rPr>
-          <w:rFonts w:ascii="Times New Roman" w:eastAsia="Times New Roman" w:hAnsi="Times New Roman" w:cs="Times New Roman"/>
-          <w:sz w:val="24"/>
-          <w:szCs w:val="24"/>
-        </w:rPr>
-        <w:t xml:space="preserve"> </w:t>
-      </w:r>
-      <w:r>
-        <w:rPr>
-          <w:rFonts w:ascii="Times New Roman" w:eastAsia="Times New Roman" w:hAnsi="Times New Roman" w:cs="Times New Roman"/>
-          <w:b/>
-          <w:bCs/>
-          <w:sz w:val="24"/>
-          <w:szCs w:val="24"/>
-        </w:rPr>
-        <w:t>End-to-end testing</w:t>
-      </w:r>
-      <w:r>
-        <w:rPr>
-          <w:rFonts w:ascii="Times New Roman" w:eastAsia="Times New Roman" w:hAnsi="Times New Roman" w:cs="Times New Roman"/>
-          <w:sz w:val="24"/>
-          <w:szCs w:val="24"/>
-        </w:rPr>
-        <w:t xml:space="preserve"> </w:t>
-      </w:r>
-    </w:p>
-    <w:p>
-      <w:pPr>
-        <w:spacing w:after="0" w:line="240" w:lineRule="auto"/>
-        <w:rPr>
-          <w:rFonts w:ascii="Times New Roman" w:eastAsia="Times New Roman" w:hAnsi="Times New Roman" w:cs="Times New Roman"/>
-          <w:sz w:val="24"/>
-          <w:szCs w:val="24"/>
-        </w:rPr>
-      </w:pPr>
-      <w:proofErr w:type="gramStart"/>
-      <w:r>
-        <w:rPr>
-          <w:rFonts w:ascii="Times New Roman" w:eastAsia="Times New Roman" w:hAnsi="Symbol" w:cs="Times New Roman"/>
-          <w:sz w:val="24"/>
-          <w:szCs w:val="24"/>
-        </w:rPr>
-        <w:t></w:t>
-      </w:r>
-      <w:r>
-        <w:rPr>
-          <w:rFonts w:ascii="Times New Roman" w:eastAsia="Times New Roman" w:hAnsi="Times New Roman" w:cs="Times New Roman"/>
-          <w:sz w:val="24"/>
-          <w:szCs w:val="24"/>
-        </w:rPr>
-        <w:t xml:space="preserve">  </w:t>
-      </w:r>
-      <w:r>
-        <w:rPr>
-          <w:rFonts w:ascii="Times New Roman" w:eastAsia="Times New Roman" w:hAnsi="Times New Roman" w:cs="Times New Roman"/>
-          <w:sz w:val="24"/>
-          <w:szCs w:val="24"/>
-        </w:rPr>
-        <w:t/>
-      </w:r>
-      <w:proofErr w:type="gramEnd"/>
-      <w:r>
-        <w:rPr>
-          <w:rFonts w:ascii="Times New Roman" w:eastAsia="Times New Roman" w:hAnsi="Times New Roman" w:cs="Times New Roman"/>
-          <w:sz w:val="24"/>
-          <w:szCs w:val="24"/>
-        </w:rPr>
-        <w:t xml:space="preserve"> </w:t>
-      </w:r>
-      <w:r>
-        <w:rPr>
-          <w:rFonts w:ascii="Times New Roman" w:eastAsia="Times New Roman" w:hAnsi="Times New Roman" w:cs="Times New Roman"/>
-          <w:b/>
-          <w:bCs/>
-          <w:sz w:val="24"/>
-          <w:szCs w:val="24"/>
-        </w:rPr>
-        <w:t>Project documentation</w:t>
-      </w:r>
-      <w:r>
-        <w:rPr>
-          <w:rFonts w:ascii="Times New Roman" w:eastAsia="Times New Roman" w:hAnsi="Times New Roman" w:cs="Times New Roman"/>
-          <w:sz w:val="24"/>
-          <w:szCs w:val="24"/>
-        </w:rPr>
-        <w:t xml:space="preserve"> </w:t>
-      </w:r>
-    </w:p>
-    <w:p>
-      <w:pPr>
-        <w:spacing w:after="0" w:line="240" w:lineRule="auto"/>
-        <w:rPr>
-          <w:rFonts w:ascii="Times New Roman" w:eastAsia="Times New Roman" w:hAnsi="Times New Roman" w:cs="Times New Roman"/>
-          <w:sz w:val="24"/>
-          <w:szCs w:val="24"/>
-        </w:rPr>
-      </w:pPr>
-      <w:proofErr w:type="gramStart"/>
-      <w:r>
-        <w:rPr>
-          <w:rFonts w:ascii="Times New Roman" w:eastAsia="Times New Roman" w:hAnsi="Symbol" w:cs="Times New Roman"/>
-          <w:sz w:val="24"/>
-          <w:szCs w:val="24"/>
-        </w:rPr>
-        <w:t></w:t>
-      </w:r>
-      <w:r>
-        <w:rPr>
-          <w:rFonts w:ascii="Times New Roman" w:eastAsia="Times New Roman" w:hAnsi="Times New Roman" w:cs="Times New Roman"/>
-          <w:sz w:val="24"/>
-          <w:szCs w:val="24"/>
-        </w:rPr>
-        <w:t xml:space="preserve">  </w:t>
-      </w:r>
-      <w:r>
-        <w:rPr>
-          <w:rFonts w:ascii="Times New Roman" w:eastAsia="Times New Roman" w:hAnsi="Times New Roman" w:cs="Times New Roman"/>
-          <w:sz w:val="24"/>
-          <w:szCs w:val="24"/>
-        </w:rPr>
-        <w:t/>
-      </w:r>
-      <w:proofErr w:type="gramEnd"/>
-      <w:r>
-        <w:rPr>
-          <w:rFonts w:ascii="Times New Roman" w:eastAsia="Times New Roman" w:hAnsi="Times New Roman" w:cs="Times New Roman"/>
-          <w:sz w:val="24"/>
-          <w:szCs w:val="24"/>
-        </w:rPr>
-        <w:t xml:space="preserve"> </w:t>
-      </w:r>
-      <w:r>
-        <w:rPr>
-          <w:rFonts w:ascii="Times New Roman" w:eastAsia="Times New Roman" w:hAnsi="Times New Roman" w:cs="Times New Roman"/>
-          <w:b/>
-          <w:bCs/>
-          <w:sz w:val="24"/>
-          <w:szCs w:val="24"/>
-        </w:rPr>
-        <w:t>requirements.txt</w:t>
-      </w:r>
-      <w:r>
-        <w:rPr>
-          <w:rFonts w:ascii="Times New Roman" w:eastAsia="Times New Roman" w:hAnsi="Times New Roman" w:cs="Times New Roman"/>
-          <w:sz w:val="24"/>
-          <w:szCs w:val="24"/>
-        </w:rPr>
-        <w:t xml:space="preserve"> </w:t>
-      </w:r>
-    </w:p>
-    <w:p>
-      <w:pPr>
-        <w:spacing w:after="0" w:line="240" w:lineRule="auto"/>
-        <w:rPr>
-          <w:rFonts w:ascii="Times New Roman" w:eastAsia="Times New Roman" w:hAnsi="Times New Roman" w:cs="Times New Roman"/>
-          <w:sz w:val="24"/>
-          <w:szCs w:val="24"/>
-        </w:rPr>
-      </w:pPr>
-      <w:proofErr w:type="gramStart"/>
-      <w:r>
-        <w:rPr>
-          <w:rFonts w:ascii="Times New Roman" w:eastAsia="Times New Roman" w:hAnsi="Symbol" w:cs="Times New Roman"/>
-          <w:sz w:val="24"/>
-          <w:szCs w:val="24"/>
-        </w:rPr>
-        <w:t></w:t>
-      </w:r>
-      <w:r>
-        <w:rPr>
-          <w:rFonts w:ascii="Times New Roman" w:eastAsia="Times New Roman" w:hAnsi="Times New Roman" w:cs="Times New Roman"/>
-          <w:sz w:val="24"/>
-          <w:szCs w:val="24"/>
-        </w:rPr>
-        <w:t xml:space="preserve">  </w:t>
-      </w:r>
-      <w:r>
-        <w:rPr>
-          <w:rFonts w:ascii="Times New Roman" w:eastAsia="Times New Roman" w:hAnsi="Times New Roman" w:cs="Times New Roman"/>
-          <w:sz w:val="24"/>
-          <w:szCs w:val="24"/>
-        </w:rPr>
-        <w:t/>
-      </w:r>
-      <w:proofErr w:type="gramEnd"/>
-      <w:r>
-        <w:rPr>
-          <w:rFonts w:ascii="Times New Roman" w:eastAsia="Times New Roman" w:hAnsi="Times New Roman" w:cs="Times New Roman"/>
-          <w:sz w:val="24"/>
-          <w:szCs w:val="24"/>
-        </w:rPr>
-        <w:t xml:space="preserve"> </w:t>
-      </w:r>
-      <w:proofErr w:type="spellStart"/>
-      <w:r>
-        <w:rPr>
-          <w:rFonts w:ascii="Times New Roman" w:eastAsia="Times New Roman" w:hAnsi="Times New Roman" w:cs="Times New Roman"/>
-          <w:b/>
-          <w:bCs/>
-          <w:sz w:val="24"/>
-          <w:szCs w:val="24"/>
-        </w:rPr>
-        <w:t>GitHub</w:t>
-      </w:r>
-      <w:proofErr w:type="spellEnd"/>
-      <w:r>
-        <w:rPr>
-          <w:rFonts w:ascii="Times New Roman" w:eastAsia="Times New Roman" w:hAnsi="Times New Roman" w:cs="Times New Roman"/>
-          <w:b/>
-          <w:bCs/>
-          <w:sz w:val="24"/>
-          <w:szCs w:val="24"/>
-        </w:rPr>
-        <w:t xml:space="preserve"> README</w:t>
-      </w:r>
-      <w:r>
-        <w:rPr>
-          <w:rFonts w:ascii="Times New Roman" w:eastAsia="Times New Roman" w:hAnsi="Times New Roman" w:cs="Times New Roman"/>
-          <w:sz w:val="24"/>
-          <w:szCs w:val="24"/>
-        </w:rPr>
-        <w:t xml:space="preserve"> </w:t>
-      </w:r>
-    </w:p>
-    <w:p>
-      <w:proofErr w:type="gramStart"/>
-      <w:r>
-        <w:rPr>
-          <w:rFonts w:ascii="Times New Roman" w:eastAsia="Times New Roman" w:hAnsi="Symbol" w:cs="Times New Roman"/>
-          <w:sz w:val="24"/>
-          <w:szCs w:val="24"/>
-        </w:rPr>
-        <w:t></w:t>
-      </w:r>
-      <w:r>
-        <w:rPr>
-          <w:rFonts w:ascii="Times New Roman" w:eastAsia="Times New Roman" w:hAnsi="Times New Roman" w:cs="Times New Roman"/>
-          <w:sz w:val="24"/>
-          <w:szCs w:val="24"/>
-        </w:rPr>
-        <w:t xml:space="preserve">  </w:t>
-      </w:r>
-      <w:r>
-        <w:rPr>
-          <w:rFonts w:ascii="Times New Roman" w:eastAsia="Times New Roman" w:hAnsi="Times New Roman" w:cs="Times New Roman"/>
-          <w:sz w:val="24"/>
-          <w:szCs w:val="24"/>
-        </w:rPr>
-        <w:t/>
-      </w:r>
-      <w:proofErr w:type="gramEnd"/>
-      <w:r>
-        <w:rPr>
-          <w:rFonts w:ascii="Times New Roman" w:eastAsia="Times New Roman" w:hAnsi="Times New Roman" w:cs="Times New Roman"/>
-          <w:sz w:val="24"/>
-          <w:szCs w:val="24"/>
-        </w:rPr>
-        <w:t xml:space="preserve"> </w:t>
-      </w:r>
-      <w:proofErr w:type="spellStart"/>
-      <w:r>
-        <w:rPr>
-          <w:rFonts w:ascii="Times New Roman" w:eastAsia="Times New Roman" w:hAnsi="Times New Roman" w:cs="Times New Roman"/>
-          <w:b/>
-          <w:bCs/>
-          <w:sz w:val="24"/>
-          <w:szCs w:val="24"/>
-        </w:rPr>
-        <w:t>Docker</w:t>
-      </w:r>
-      <w:proofErr w:type="spellEnd"/>
-      <w:r>
-        <w:rPr>
-          <w:rFonts w:ascii="Times New Roman" w:eastAsia="Times New Roman" w:hAnsi="Times New Roman" w:cs="Times New Roman"/>
-          <w:b/>
-          <w:bCs/>
-          <w:sz w:val="24"/>
-          <w:szCs w:val="24"/>
-        </w:rPr>
-        <w:t>/deployment</w:t>
+        <w:drawing>
+          <wp:inline distT="0" distB="0" distL="0" distR="0" wp14:anchorId="6F33E031" wp14:editId="2EB09D2C">
+            <wp:extent cx="5943600" cy="5664200"/>
+            <wp:effectExtent l="0" t="0" r="0" b="0"/>
+            <wp:docPr id="1" name="Picture 1"/>
+            <wp:cNvGraphicFramePr>
+              <a:graphicFrameLocks xmlns:a="http://schemas.openxmlformats.org/drawingml/2006/main" noChangeAspect="1"/>
+            </wp:cNvGraphicFramePr>
+            <a:graphic xmlns:a="http://schemas.openxmlformats.org/drawingml/2006/main">
+              <a:graphicData uri="http://schemas.openxmlformats.org/drawingml/2006/picture">
+                <pic:pic xmlns:pic="http://schemas.openxmlformats.org/drawingml/2006/picture">
+                  <pic:nvPicPr>
+                    <pic:cNvPr id="0" name=""/>
+                    <pic:cNvPicPr/>
+                  </pic:nvPicPr>
+                  <pic:blipFill>
+                    <a:blip r:embed="rId6"/>
+                    <a:stretch>
+                      <a:fillRect/>
+                    </a:stretch>
+                  </pic:blipFill>
+                  <pic:spPr>
+                    <a:xfrm>
+                      <a:off x="0" y="0"/>
+                      <a:ext cx="5943600" cy="5664200"/>
+                    </a:xfrm>
+                    <a:prstGeom prst="rect">
+                      <a:avLst/>
+                    </a:prstGeom>
+                  </pic:spPr>
+                </pic:pic>
+              </a:graphicData>
+            </a:graphic>
+          </wp:inline>
+        </w:drawing>
       </w:r>
       <w:bookmarkStart w:id="0" w:name="_GoBack"/>
       <w:bookmarkEnd w:id="0"/>

</xml_diff>